<commit_message>
Add role-based access control with attorney data scoping
Three roles: admin (full access), collections (AR/NOIW/dunning), attorney
(own cases only). Attorney users see only their cases across all dashboard
pages via lead_attorney_name filtering. Includes setup_users.py for
provisioning accounts from active caseload, role-conditional navigation,
route guards, and live-computed attorney KPI metrics.

Co-Authored-By: Claude Opus 4.6 <noreply@anthropic.com>
</commit_message>
<xml_diff>
--- a/data/templates/Petition_for_Review.docx
+++ b/data/templates/Petition_for_Review.docx
@@ -1,47 +1,41 @@
 
 <file path=word/document.xml><?xml version="1.0" encoding="utf-8"?>
-<w:document xmlns:wpc="http://schemas.microsoft.com/office/word/2010/wordprocessingCanvas" xmlns:cx="http://schemas.microsoft.com/office/drawing/2014/chartex" xmlns:cx1="http://schemas.microsoft.com/office/drawing/2015/9/8/chartex" xmlns:cx2="http://schemas.microsoft.com/office/drawing/2015/10/21/chartex" xmlns:cx3="http://schemas.microsoft.com/office/drawing/2016/5/9/chartex" xmlns:cx4="http://schemas.microsoft.com/office/drawing/2016/5/10/chartex" xmlns:cx5="http://schemas.microsoft.com/office/drawing/2016/5/11/chartex" xmlns:cx6="http://schemas.microsoft.com/office/drawing/2016/5/12/chartex" xmlns:cx7="http://schemas.microsoft.com/office/drawing/2016/5/13/chartex" xmlns:cx8="http://schemas.microsoft.com/office/drawing/2016/5/14/chartex" xmlns:mc="http://schemas.openxmlformats.org/markup-compatibility/2006" xmlns:aink="http://schemas.microsoft.com/office/drawing/2016/ink" xmlns:am3d="http://schemas.microsoft.com/office/drawing/2017/model3d" xmlns:o="urn:schemas-microsoft-com:office:office" xmlns:r="http://schemas.openxmlformats.org/officeDocument/2006/relationships" xmlns:m="http://schemas.openxmlformats.org/officeDocument/2006/math" xmlns:v="urn:schemas-microsoft-com:vml" xmlns:wp14="http://schemas.microsoft.com/office/word/2010/wordprocessingDrawing" xmlns:wp="http://schemas.openxmlformats.org/drawingml/2006/wordprocessingDrawing" xmlns:w10="urn:schemas-microsoft-com:office:word" xmlns:w="http://schemas.openxmlformats.org/wordprocessingml/2006/main" xmlns:w14="http://schemas.microsoft.com/office/word/2010/wordml" xmlns:w15="http://schemas.microsoft.com/office/word/2012/wordml" xmlns:w16cid="http://schemas.microsoft.com/office/word/2016/wordml/cid" xmlns:w16se="http://schemas.microsoft.com/office/word/2015/wordml/symex" xmlns:wpg="http://schemas.microsoft.com/office/word/2010/wordprocessingGroup" xmlns:wpi="http://schemas.microsoft.com/office/word/2010/wordprocessingInk" xmlns:wne="http://schemas.microsoft.com/office/word/2006/wordml" xmlns:wps="http://schemas.microsoft.com/office/word/2010/wordprocessingShape" mc:Ignorable="w14 w15 w16se w16cid wp14">
+<w:document xmlns:wpc="http://schemas.microsoft.com/office/word/2010/wordprocessingCanvas" xmlns:cx="http://schemas.microsoft.com/office/drawing/2014/chartex" xmlns:cx1="http://schemas.microsoft.com/office/drawing/2015/9/8/chartex" xmlns:cx2="http://schemas.microsoft.com/office/drawing/2015/10/21/chartex" xmlns:cx3="http://schemas.microsoft.com/office/drawing/2016/5/9/chartex" xmlns:cx4="http://schemas.microsoft.com/office/drawing/2016/5/10/chartex" xmlns:cx5="http://schemas.microsoft.com/office/drawing/2016/5/11/chartex" xmlns:cx6="http://schemas.microsoft.com/office/drawing/2016/5/12/chartex" xmlns:cx7="http://schemas.microsoft.com/office/drawing/2016/5/13/chartex" xmlns:cx8="http://schemas.microsoft.com/office/drawing/2016/5/14/chartex" xmlns:mc="http://schemas.openxmlformats.org/markup-compatibility/2006" xmlns:aink="http://schemas.microsoft.com/office/drawing/2016/ink" xmlns:am3d="http://schemas.microsoft.com/office/drawing/2017/model3d" xmlns:o="urn:schemas-microsoft-com:office:office" xmlns:oel="http://schemas.microsoft.com/office/2019/extlst" xmlns:r="http://schemas.openxmlformats.org/officeDocument/2006/relationships" xmlns:m="http://schemas.openxmlformats.org/officeDocument/2006/math" xmlns:v="urn:schemas-microsoft-com:vml" xmlns:wp14="http://schemas.microsoft.com/office/word/2010/wordprocessingDrawing" xmlns:wp="http://schemas.openxmlformats.org/drawingml/2006/wordprocessingDrawing" xmlns:w10="urn:schemas-microsoft-com:office:word" xmlns:w="http://schemas.openxmlformats.org/wordprocessingml/2006/main" xmlns:w14="http://schemas.microsoft.com/office/word/2010/wordml" xmlns:w15="http://schemas.microsoft.com/office/word/2012/wordml" xmlns:w16cex="http://schemas.microsoft.com/office/word/2018/wordml/cex" xmlns:w16cid="http://schemas.microsoft.com/office/word/2016/wordml/cid" xmlns:w16="http://schemas.microsoft.com/office/word/2018/wordml" xmlns:w16du="http://schemas.microsoft.com/office/word/2023/wordml/word16du" xmlns:w16sdtdh="http://schemas.microsoft.com/office/word/2020/wordml/sdtdatahash" xmlns:w16se="http://schemas.microsoft.com/office/word/2015/wordml/symex" xmlns:wpg="http://schemas.microsoft.com/office/word/2010/wordprocessingGroup" xmlns:wpi="http://schemas.microsoft.com/office/word/2010/wordprocessingInk" xmlns:wne="http://schemas.microsoft.com/office/word/2006/wordml" xmlns:wps="http://schemas.microsoft.com/office/word/2010/wordprocessingShape" mc:Ignorable="w14 w15 w16se w16cid w16 w16cex w16sdtdh w16du wp14">
   <w:body>
     <w:p>
       <w:pPr>
         <w:spacing w:after="0" w:line="240" w:lineRule="auto"/>
         <w:jc w:val="center"/>
         <w:rPr>
-          <w:rFonts w:ascii="Times New Roman" w:eastAsia="Times New Roman" w:hAnsi="Times New Roman" w:cs="Times New Roman"/>
-          <w:b/>
-          <w:color w:val="000000"/>
-          <w:sz w:val="24"/>
-          <w:szCs w:val="24"/>
-        </w:rPr>
-      </w:pPr>
-      <w:r>
-        <w:rPr>
-          <w:rFonts w:ascii="Times New Roman" w:eastAsia="Times New Roman" w:hAnsi="Times New Roman" w:cs="Times New Roman"/>
-          <w:b/>
-          <w:color w:val="000000"/>
-          <w:sz w:val="24"/>
-          <w:szCs w:val="24"/>
-        </w:rPr>
-        <w:t xml:space="preserve">IN THE CIRCUIT COURT OF {{county}} COUNTY </w:t>
-      </w:r>
-      <w:r>
-        <w:rPr>
-          <w:rFonts w:ascii="Times New Roman" w:eastAsia="Times New Roman" w:hAnsi="Times New Roman" w:cs="Times New Roman"/>
-          <w:b/>
-          <w:color w:val="000000"/>
-          <w:sz w:val="24"/>
-          <w:szCs w:val="24"/>
-          <w:highlight w:val="yellow"/>
-        </w:rPr>
-      </w:r>
-      <w:r>
-        <w:rPr>
-          <w:rFonts w:ascii="Times New Roman" w:eastAsia="Times New Roman" w:hAnsi="Times New Roman" w:cs="Times New Roman"/>
-          <w:b/>
-          <w:color w:val="000000"/>
-          <w:sz w:val="24"/>
-          <w:szCs w:val="24"/>
-        </w:rPr>
+          <w:rFonts w:ascii="Times New Roman" w:hAnsi="Times New Roman" w:eastAsia="Times New Roman" w:cs="Times New Roman"/>
+          <w:b w:val="1"/>
+          <w:bCs w:val="1"/>
+          <w:color w:val="000000"/>
+          <w:sz w:val="24"/>
+          <w:szCs w:val="24"/>
+        </w:rPr>
+      </w:pPr>
+      <w:r>
+        <w:rPr>
+          <w:rFonts w:ascii="Times New Roman" w:hAnsi="Times New Roman" w:eastAsia="Times New Roman" w:cs="Times New Roman"/>
+          <w:b w:val="1"/>
+          <w:bCs w:val="1"/>
+          <w:color w:val="000000" w:themeColor="text1" w:themeTint="FF" w:themeShade="FF"/>
+          <w:sz w:val="24"/>
+          <w:szCs w:val="24"/>
+        </w:rPr>
+        <w:t xml:space="preserve">IN THE CIRCUIT COURT OF </w:t>
+      </w:r>
+      <w:r>
+        <w:rPr>
+          <w:rFonts w:ascii="Times New Roman" w:hAnsi="Times New Roman" w:eastAsia="Times New Roman" w:cs="Times New Roman"/>
+          <w:b w:val="1"/>
+          <w:bCs w:val="1"/>
+          <w:color w:val="000000" w:themeColor="text1" w:themeTint="FF" w:themeShade="FF"/>
+          <w:sz w:val="24"/>
+          <w:szCs w:val="24"/>
+        </w:rPr>
+        <w:t>{{COURT_JURISDICTION}}</w:t>
       </w:r>
     </w:p>
     <w:p>
@@ -49,7 +43,7 @@
         <w:spacing w:after="0" w:line="240" w:lineRule="auto"/>
         <w:jc w:val="center"/>
         <w:rPr>
-          <w:rFonts w:ascii="Times New Roman" w:eastAsia="Times New Roman" w:hAnsi="Times New Roman" w:cs="Times New Roman"/>
+          <w:rFonts w:ascii="Times New Roman" w:hAnsi="Times New Roman" w:eastAsia="Times New Roman" w:cs="Times New Roman"/>
           <w:b/>
           <w:color w:val="000000"/>
           <w:sz w:val="24"/>
@@ -58,7 +52,7 @@
       </w:pPr>
       <w:r>
         <w:rPr>
-          <w:rFonts w:ascii="Times New Roman" w:eastAsia="Times New Roman" w:hAnsi="Times New Roman" w:cs="Times New Roman"/>
+          <w:rFonts w:ascii="Times New Roman" w:hAnsi="Times New Roman" w:eastAsia="Times New Roman" w:cs="Times New Roman"/>
           <w:b/>
           <w:color w:val="000000"/>
           <w:sz w:val="24"/>
@@ -72,7 +66,7 @@
         <w:spacing w:after="0" w:line="240" w:lineRule="auto"/>
         <w:jc w:val="center"/>
         <w:rPr>
-          <w:rFonts w:ascii="Times New Roman" w:eastAsia="Times New Roman" w:hAnsi="Times New Roman" w:cs="Times New Roman"/>
+          <w:rFonts w:ascii="Times New Roman" w:hAnsi="Times New Roman" w:eastAsia="Times New Roman" w:cs="Times New Roman"/>
           <w:sz w:val="24"/>
           <w:szCs w:val="24"/>
         </w:rPr>
@@ -82,33 +76,64 @@
       <w:pPr>
         <w:spacing w:after="0" w:line="240" w:lineRule="auto"/>
         <w:rPr>
-          <w:rFonts w:ascii="Times New Roman" w:eastAsia="Times New Roman" w:hAnsi="Times New Roman" w:cs="Times New Roman"/>
-          <w:sz w:val="24"/>
-          <w:szCs w:val="24"/>
-        </w:rPr>
-      </w:pPr>
-      <w:r>
-        <w:rPr>
-          <w:rFonts w:ascii="Times New Roman" w:eastAsia="Times New Roman" w:hAnsi="Times New Roman" w:cs="Times New Roman"/>
-          <w:color w:val="000000"/>
-          <w:sz w:val="24"/>
-          <w:szCs w:val="24"/>
-          <w:highlight w:val="yellow"/>
+          <w:rFonts w:ascii="Times New Roman" w:hAnsi="Times New Roman" w:eastAsia="Times New Roman" w:cs="Times New Roman"/>
+          <w:sz w:val="24"/>
+          <w:szCs w:val="24"/>
+        </w:rPr>
+      </w:pPr>
+      <w:r>
+        <w:rPr>
+          <w:rFonts w:ascii="Times New Roman" w:hAnsi="Times New Roman" w:eastAsia="Times New Roman" w:cs="Times New Roman"/>
+          <w:color w:val="000000"/>
+          <w:sz w:val="24"/>
+          <w:szCs w:val="24"/>
         </w:rPr>
         <w:t>{{petitioner_name}}</w:t>
       </w:r>
       <w:r>
         <w:rPr>
-          <w:rFonts w:ascii="Times New Roman" w:eastAsia="Times New Roman" w:hAnsi="Times New Roman" w:cs="Times New Roman"/>
-          <w:color w:val="000000"/>
-          <w:sz w:val="24"/>
-          <w:szCs w:val="24"/>
-        </w:rPr>
-        <w:t xml:space="preserve">,              </w:t>
-        <w:tab/>
-        <w:t xml:space="preserve">   </w:t>
-        <w:tab/>
-        <w:t xml:space="preserve">                    )</w:t>
+          <w:rFonts w:ascii="Times New Roman" w:hAnsi="Times New Roman" w:eastAsia="Times New Roman" w:cs="Times New Roman"/>
+          <w:color w:val="000000" w:themeColor="text1" w:themeTint="FF" w:themeShade="FF"/>
+          <w:sz w:val="24"/>
+          <w:szCs w:val="24"/>
+        </w:rPr>
+        <w:t>,</w:t>
+      </w:r>
+      <w:r>
+        <w:tab/>
+      </w:r>
+      <w:r>
+        <w:rPr>
+          <w:rFonts w:ascii="Times New Roman" w:hAnsi="Times New Roman" w:eastAsia="Times New Roman" w:cs="Times New Roman"/>
+          <w:color w:val="000000" w:themeColor="text1" w:themeTint="FF" w:themeShade="FF"/>
+          <w:sz w:val="24"/>
+          <w:szCs w:val="24"/>
+        </w:rPr>
+        <w:t xml:space="preserve">      </w:t>
+      </w:r>
+      <w:r>
+        <w:tab/>
+      </w:r>
+      <w:r>
+        <w:rPr>
+          <w:rFonts w:ascii="Times New Roman" w:hAnsi="Times New Roman" w:eastAsia="Times New Roman" w:cs="Times New Roman"/>
+          <w:color w:val="000000" w:themeColor="text1" w:themeTint="FF" w:themeShade="FF"/>
+          <w:sz w:val="24"/>
+          <w:szCs w:val="24"/>
+        </w:rPr>
+        <w:t xml:space="preserve">                  </w:t>
+      </w:r>
+      <w:r>
+        <w:tab/>
+      </w:r>
+      <w:r>
+        <w:rPr>
+          <w:rFonts w:ascii="Times New Roman" w:hAnsi="Times New Roman" w:eastAsia="Times New Roman" w:cs="Times New Roman"/>
+          <w:color w:val="000000" w:themeColor="text1" w:themeTint="FF" w:themeShade="FF"/>
+          <w:sz w:val="24"/>
+          <w:szCs w:val="24"/>
+        </w:rPr>
+        <w:t xml:space="preserve">        )</w:t>
       </w:r>
     </w:p>
     <w:p>
@@ -116,41 +141,53 @@
         <w:spacing w:after="0" w:line="240" w:lineRule="auto"/>
         <w:ind w:firstLine="70"/>
         <w:rPr>
-          <w:rFonts w:ascii="Times New Roman" w:eastAsia="Times New Roman" w:hAnsi="Times New Roman" w:cs="Times New Roman"/>
-          <w:color w:val="000000"/>
-          <w:sz w:val="24"/>
-          <w:szCs w:val="24"/>
-        </w:rPr>
-      </w:pPr>
-      <w:r>
-        <w:rPr>
-          <w:rFonts w:ascii="Times New Roman" w:eastAsia="Times New Roman" w:hAnsi="Times New Roman" w:cs="Times New Roman"/>
-          <w:color w:val="000000"/>
-          <w:sz w:val="24"/>
-          <w:szCs w:val="24"/>
-        </w:rPr>
-        <w:t>{{petitioner_name}},</w:t>
-        <w:tab/>
-        <w:tab/>
-        <w:tab/>
+          <w:rFonts w:ascii="Times New Roman" w:hAnsi="Times New Roman" w:eastAsia="Times New Roman" w:cs="Times New Roman"/>
+          <w:color w:val="000000"/>
+          <w:sz w:val="24"/>
+          <w:szCs w:val="24"/>
+        </w:rPr>
+      </w:pPr>
+      <w:r>
+        <w:rPr>
+          <w:rFonts w:ascii="Times New Roman" w:hAnsi="Times New Roman" w:eastAsia="Times New Roman" w:cs="Times New Roman"/>
+          <w:color w:val="000000" w:themeColor="text1" w:themeTint="FF" w:themeShade="FF"/>
+          <w:sz w:val="24"/>
+          <w:szCs w:val="24"/>
+        </w:rPr>
+        <w:t xml:space="preserve">DLN: </w:t>
+      </w:r>
+      <w:r>
+        <w:rPr>
+          <w:rFonts w:ascii="Times New Roman" w:hAnsi="Times New Roman" w:eastAsia="Times New Roman" w:cs="Times New Roman"/>
+          <w:color w:val="000000"/>
+          <w:sz w:val="24"/>
+          <w:szCs w:val="24"/>
+        </w:rPr>
+        <w:t>{{dln}}</w:t>
+      </w:r>
+      <w:r>
+        <w:rPr>
+          <w:rFonts w:ascii="Times New Roman" w:hAnsi="Times New Roman" w:eastAsia="Times New Roman" w:cs="Times New Roman"/>
+          <w:color w:val="000000" w:themeColor="text1" w:themeTint="FF" w:themeShade="FF"/>
+          <w:sz w:val="24"/>
+          <w:szCs w:val="24"/>
+        </w:rPr>
+        <w:t>,</w:t>
+      </w:r>
+      <w:r>
+        <w:tab/>
+        <w:tab/>
+        <w:tab/>
+        <w:tab/>
+      </w:r>
+      <w:r>
+        <w:rPr>
+          <w:rFonts w:ascii="Times New Roman" w:hAnsi="Times New Roman" w:eastAsia="Times New Roman" w:cs="Times New Roman"/>
+          <w:color w:val="000000" w:themeColor="text1" w:themeTint="FF" w:themeShade="FF"/>
+          <w:sz w:val="24"/>
+          <w:szCs w:val="24"/>
+        </w:rPr>
         <w:t xml:space="preserve">        )  </w:t>
-      </w:r>
-      <w:r>
-        <w:rPr>
-          <w:rFonts w:ascii="Times New Roman" w:eastAsia="Times New Roman" w:hAnsi="Times New Roman" w:cs="Times New Roman"/>
-          <w:color w:val="000000"/>
-          <w:sz w:val="24"/>
-          <w:szCs w:val="24"/>
-          <w:highlight w:val="yellow"/>
-        </w:rPr>
-      </w:r>
-      <w:r>
-        <w:rPr>
-          <w:rFonts w:ascii="Times New Roman" w:eastAsia="Times New Roman" w:hAnsi="Times New Roman" w:cs="Times New Roman"/>
-          <w:color w:val="000000"/>
-          <w:sz w:val="24"/>
-          <w:szCs w:val="24"/>
-        </w:rPr>
       </w:r>
     </w:p>
     <w:p>
@@ -158,43 +195,64 @@
         <w:spacing w:after="0" w:line="240" w:lineRule="auto"/>
         <w:ind w:firstLine="70"/>
         <w:rPr>
-          <w:rFonts w:ascii="Times New Roman" w:eastAsia="Times New Roman" w:hAnsi="Times New Roman" w:cs="Times New Roman"/>
-          <w:sz w:val="24"/>
-          <w:szCs w:val="24"/>
-        </w:rPr>
-      </w:pPr>
-      <w:r>
-        <w:rPr>
-          <w:rFonts w:ascii="Times New Roman" w:eastAsia="Times New Roman" w:hAnsi="Times New Roman" w:cs="Times New Roman"/>
-          <w:color w:val="000000"/>
-          <w:sz w:val="24"/>
-          <w:szCs w:val="24"/>
-        </w:rPr>
-        <w:t>DOB: {{dob}}</w:t>
-        <w:tab/>
-        <w:tab/>
-        <w:tab/>
-        <w:tab/>
+          <w:rFonts w:ascii="Times New Roman" w:hAnsi="Times New Roman" w:eastAsia="Times New Roman" w:cs="Times New Roman"/>
+          <w:sz w:val="24"/>
+          <w:szCs w:val="24"/>
+        </w:rPr>
+      </w:pPr>
+      <w:r>
+        <w:rPr>
+          <w:rFonts w:ascii="Times New Roman" w:hAnsi="Times New Roman" w:eastAsia="Times New Roman" w:cs="Times New Roman"/>
+          <w:color w:val="000000" w:themeColor="text1" w:themeTint="FF" w:themeShade="FF"/>
+          <w:sz w:val="24"/>
+          <w:szCs w:val="24"/>
+        </w:rPr>
+        <w:t xml:space="preserve">DOB: </w:t>
+      </w:r>
+      <w:r>
+        <w:rPr>
+          <w:rFonts w:ascii="Times New Roman" w:hAnsi="Times New Roman" w:eastAsia="Times New Roman" w:cs="Times New Roman"/>
+          <w:color w:val="000000"/>
+          <w:sz w:val="24"/>
+          <w:szCs w:val="24"/>
+        </w:rPr>
+        <w:t>{{dob}}</w:t>
+      </w:r>
+      <w:r>
+        <w:rPr>
+          <w:rFonts w:ascii="Times New Roman" w:hAnsi="Times New Roman" w:eastAsia="Times New Roman" w:cs="Times New Roman"/>
+          <w:color w:val="000000" w:themeColor="text1" w:themeTint="FF" w:themeShade="FF"/>
+          <w:sz w:val="24"/>
+          <w:szCs w:val="24"/>
+        </w:rPr>
+        <w:t>,</w:t>
+      </w:r>
+      <w:r>
+        <w:tab/>
+        <w:tab/>
+        <w:tab/>
+        <w:tab/>
+      </w:r>
+      <w:r>
+        <w:rPr>
+          <w:rFonts w:ascii="Times New Roman" w:hAnsi="Times New Roman" w:eastAsia="Times New Roman" w:cs="Times New Roman"/>
+          <w:color w:val="000000" w:themeColor="text1" w:themeTint="FF" w:themeShade="FF"/>
+          <w:sz w:val="24"/>
+          <w:szCs w:val="24"/>
+        </w:rPr>
         <w:t xml:space="preserve">        )</w:t>
-        <w:tab/>
+      </w:r>
+      <w:r>
+        <w:tab/>
+      </w:r>
+      <w:r>
+        <w:rPr>
+          <w:rFonts w:ascii="Times New Roman" w:hAnsi="Times New Roman" w:eastAsia="Times New Roman" w:cs="Times New Roman"/>
+          <w:color w:val="000000" w:themeColor="text1" w:themeTint="FF" w:themeShade="FF"/>
+          <w:sz w:val="24"/>
+          <w:szCs w:val="24"/>
+        </w:rPr>
         <w:t xml:space="preserve">  </w:t>
-      </w:r>
-      <w:r>
-        <w:rPr>
-          <w:rFonts w:ascii="Times New Roman" w:eastAsia="Times New Roman" w:hAnsi="Times New Roman" w:cs="Times New Roman"/>
-          <w:color w:val="000000"/>
-          <w:sz w:val="24"/>
-          <w:szCs w:val="24"/>
-          <w:highlight w:val="yellow"/>
-        </w:rPr>
-      </w:r>
-      <w:r>
-        <w:rPr>
-          <w:rFonts w:ascii="Times New Roman" w:eastAsia="Times New Roman" w:hAnsi="Times New Roman" w:cs="Times New Roman"/>
-          <w:color w:val="000000"/>
-          <w:sz w:val="24"/>
-          <w:szCs w:val="24"/>
-        </w:rPr>
       </w:r>
     </w:p>
     <w:p>
@@ -202,15 +260,15 @@
         <w:spacing w:after="0" w:line="240" w:lineRule="auto"/>
         <w:ind w:firstLine="30"/>
         <w:rPr>
-          <w:rFonts w:ascii="Times New Roman" w:eastAsia="Times New Roman" w:hAnsi="Times New Roman" w:cs="Times New Roman"/>
-          <w:color w:val="000000"/>
-          <w:sz w:val="24"/>
-          <w:szCs w:val="24"/>
-        </w:rPr>
-      </w:pPr>
-      <w:r>
-        <w:rPr>
-          <w:rFonts w:ascii="Times New Roman" w:eastAsia="Times New Roman" w:hAnsi="Times New Roman" w:cs="Times New Roman"/>
+          <w:rFonts w:ascii="Times New Roman" w:hAnsi="Times New Roman" w:eastAsia="Times New Roman" w:cs="Times New Roman"/>
+          <w:color w:val="000000"/>
+          <w:sz w:val="24"/>
+          <w:szCs w:val="24"/>
+        </w:rPr>
+      </w:pPr>
+      <w:r>
+        <w:rPr>
+          <w:rFonts w:ascii="Times New Roman" w:hAnsi="Times New Roman" w:eastAsia="Times New Roman" w:cs="Times New Roman"/>
           <w:color w:val="000000"/>
           <w:sz w:val="24"/>
           <w:szCs w:val="24"/>
@@ -223,7 +281,7 @@
         <w:tab/>
         <w:t xml:space="preserve">        )</w:t>
         <w:tab/>
-        <w:t>Cause No.: {{case_number}}</w:t>
+        <w:t xml:space="preserve">Cause No.: {{case_number}}</w:t>
       </w:r>
     </w:p>
     <w:p>
@@ -231,14 +289,14 @@
         <w:spacing w:after="0" w:line="240" w:lineRule="auto"/>
         <w:ind w:firstLine="30"/>
         <w:rPr>
-          <w:rFonts w:ascii="Times New Roman" w:eastAsia="Times New Roman" w:hAnsi="Times New Roman" w:cs="Times New Roman"/>
-          <w:sz w:val="24"/>
-          <w:szCs w:val="24"/>
-        </w:rPr>
-      </w:pPr>
-      <w:r>
-        <w:rPr>
-          <w:rFonts w:ascii="Times New Roman" w:eastAsia="Times New Roman" w:hAnsi="Times New Roman" w:cs="Times New Roman"/>
+          <w:rFonts w:ascii="Times New Roman" w:hAnsi="Times New Roman" w:eastAsia="Times New Roman" w:cs="Times New Roman"/>
+          <w:sz w:val="24"/>
+          <w:szCs w:val="24"/>
+        </w:rPr>
+      </w:pPr>
+      <w:r>
+        <w:rPr>
+          <w:rFonts w:ascii="Times New Roman" w:hAnsi="Times New Roman" w:eastAsia="Times New Roman" w:cs="Times New Roman"/>
           <w:color w:val="000000"/>
           <w:sz w:val="24"/>
           <w:szCs w:val="24"/>
@@ -251,14 +309,14 @@
         <w:spacing w:after="0" w:line="240" w:lineRule="auto"/>
         <w:ind w:firstLine="70"/>
         <w:rPr>
-          <w:rFonts w:ascii="Times New Roman" w:eastAsia="Times New Roman" w:hAnsi="Times New Roman" w:cs="Times New Roman"/>
-          <w:sz w:val="24"/>
-          <w:szCs w:val="24"/>
-        </w:rPr>
-      </w:pPr>
-      <w:r>
-        <w:rPr>
-          <w:rFonts w:ascii="Times New Roman" w:eastAsia="Times New Roman" w:hAnsi="Times New Roman" w:cs="Times New Roman"/>
+          <w:rFonts w:ascii="Times New Roman" w:hAnsi="Times New Roman" w:eastAsia="Times New Roman" w:cs="Times New Roman"/>
+          <w:sz w:val="24"/>
+          <w:szCs w:val="24"/>
+        </w:rPr>
+      </w:pPr>
+      <w:r>
+        <w:rPr>
+          <w:rFonts w:ascii="Times New Roman" w:hAnsi="Times New Roman" w:eastAsia="Times New Roman" w:cs="Times New Roman"/>
           <w:color w:val="000000"/>
           <w:sz w:val="24"/>
           <w:szCs w:val="24"/>
@@ -287,15 +345,15 @@
         </w:tabs>
         <w:spacing w:after="0" w:line="240" w:lineRule="auto"/>
         <w:rPr>
-          <w:rFonts w:ascii="Times New Roman" w:eastAsia="Times New Roman" w:hAnsi="Times New Roman" w:cs="Times New Roman"/>
-          <w:color w:val="000000"/>
-          <w:sz w:val="24"/>
-          <w:szCs w:val="24"/>
-        </w:rPr>
-      </w:pPr>
-      <w:r>
-        <w:rPr>
-          <w:rFonts w:ascii="Times New Roman" w:eastAsia="Times New Roman" w:hAnsi="Times New Roman" w:cs="Times New Roman"/>
+          <w:rFonts w:ascii="Times New Roman" w:hAnsi="Times New Roman" w:eastAsia="Times New Roman" w:cs="Times New Roman"/>
+          <w:color w:val="000000"/>
+          <w:sz w:val="24"/>
+          <w:szCs w:val="24"/>
+        </w:rPr>
+      </w:pPr>
+      <w:r>
+        <w:rPr>
+          <w:rFonts w:ascii="Times New Roman" w:hAnsi="Times New Roman" w:eastAsia="Times New Roman" w:cs="Times New Roman"/>
           <w:color w:val="000000"/>
           <w:sz w:val="24"/>
           <w:szCs w:val="24"/>
@@ -316,14 +374,14 @@
       <w:pPr>
         <w:spacing w:after="0" w:line="240" w:lineRule="auto"/>
         <w:rPr>
-          <w:rFonts w:ascii="Times New Roman" w:eastAsia="Times New Roman" w:hAnsi="Times New Roman" w:cs="Times New Roman"/>
-          <w:sz w:val="24"/>
-          <w:szCs w:val="24"/>
-        </w:rPr>
-      </w:pPr>
-      <w:r>
-        <w:rPr>
-          <w:rFonts w:ascii="Times New Roman" w:eastAsia="Times New Roman" w:hAnsi="Times New Roman" w:cs="Times New Roman"/>
+          <w:rFonts w:ascii="Times New Roman" w:hAnsi="Times New Roman" w:eastAsia="Times New Roman" w:cs="Times New Roman"/>
+          <w:sz w:val="24"/>
+          <w:szCs w:val="24"/>
+        </w:rPr>
+      </w:pPr>
+      <w:r>
+        <w:rPr>
+          <w:rFonts w:ascii="Times New Roman" w:hAnsi="Times New Roman" w:eastAsia="Times New Roman" w:cs="Times New Roman"/>
           <w:color w:val="000000"/>
           <w:sz w:val="24"/>
           <w:szCs w:val="24"/>
@@ -340,14 +398,14 @@
       <w:pPr>
         <w:spacing w:after="0" w:line="240" w:lineRule="auto"/>
         <w:rPr>
-          <w:rFonts w:ascii="Times New Roman" w:eastAsia="Times New Roman" w:hAnsi="Times New Roman" w:cs="Times New Roman"/>
-          <w:sz w:val="24"/>
-          <w:szCs w:val="24"/>
-        </w:rPr>
-      </w:pPr>
-      <w:r>
-        <w:rPr>
-          <w:rFonts w:ascii="Times New Roman" w:eastAsia="Times New Roman" w:hAnsi="Times New Roman" w:cs="Times New Roman"/>
+          <w:rFonts w:ascii="Times New Roman" w:hAnsi="Times New Roman" w:eastAsia="Times New Roman" w:cs="Times New Roman"/>
+          <w:sz w:val="24"/>
+          <w:szCs w:val="24"/>
+        </w:rPr>
+      </w:pPr>
+      <w:r>
+        <w:rPr>
+          <w:rFonts w:ascii="Times New Roman" w:hAnsi="Times New Roman" w:eastAsia="Times New Roman" w:cs="Times New Roman"/>
           <w:color w:val="000000"/>
           <w:sz w:val="24"/>
           <w:szCs w:val="24"/>
@@ -364,14 +422,14 @@
         <w:spacing w:after="0" w:line="240" w:lineRule="auto"/>
         <w:ind w:firstLine="70"/>
         <w:rPr>
-          <w:rFonts w:ascii="Times New Roman" w:eastAsia="Times New Roman" w:hAnsi="Times New Roman" w:cs="Times New Roman"/>
-          <w:sz w:val="24"/>
-          <w:szCs w:val="24"/>
-        </w:rPr>
-      </w:pPr>
-      <w:r>
-        <w:rPr>
-          <w:rFonts w:ascii="Times New Roman" w:eastAsia="Times New Roman" w:hAnsi="Times New Roman" w:cs="Times New Roman"/>
+          <w:rFonts w:ascii="Times New Roman" w:hAnsi="Times New Roman" w:eastAsia="Times New Roman" w:cs="Times New Roman"/>
+          <w:sz w:val="24"/>
+          <w:szCs w:val="24"/>
+        </w:rPr>
+      </w:pPr>
+      <w:r>
+        <w:rPr>
+          <w:rFonts w:ascii="Times New Roman" w:hAnsi="Times New Roman" w:eastAsia="Times New Roman" w:cs="Times New Roman"/>
           <w:color w:val="000000"/>
           <w:sz w:val="24"/>
           <w:szCs w:val="24"/>
@@ -389,15 +447,15 @@
       <w:pPr>
         <w:spacing w:after="0" w:line="240" w:lineRule="auto"/>
         <w:rPr>
-          <w:rFonts w:ascii="Times New Roman" w:eastAsia="Times New Roman" w:hAnsi="Times New Roman" w:cs="Times New Roman"/>
-          <w:color w:val="000000"/>
-          <w:sz w:val="24"/>
-          <w:szCs w:val="24"/>
-        </w:rPr>
-      </w:pPr>
-      <w:r>
-        <w:rPr>
-          <w:rFonts w:ascii="Times New Roman" w:eastAsia="Times New Roman" w:hAnsi="Times New Roman" w:cs="Times New Roman"/>
+          <w:rFonts w:ascii="Times New Roman" w:hAnsi="Times New Roman" w:eastAsia="Times New Roman" w:cs="Times New Roman"/>
+          <w:color w:val="000000"/>
+          <w:sz w:val="24"/>
+          <w:szCs w:val="24"/>
+        </w:rPr>
+      </w:pPr>
+      <w:r>
+        <w:rPr>
+          <w:rFonts w:ascii="Times New Roman" w:hAnsi="Times New Roman" w:eastAsia="Times New Roman" w:cs="Times New Roman"/>
           <w:color w:val="000000"/>
           <w:sz w:val="24"/>
           <w:szCs w:val="24"/>
@@ -415,7 +473,7 @@
       <w:pPr>
         <w:spacing w:after="0" w:line="240" w:lineRule="auto"/>
         <w:rPr>
-          <w:rFonts w:ascii="Times New Roman" w:eastAsia="Times New Roman" w:hAnsi="Times New Roman" w:cs="Times New Roman"/>
+          <w:rFonts w:ascii="Times New Roman" w:hAnsi="Times New Roman" w:eastAsia="Times New Roman" w:cs="Times New Roman"/>
           <w:color w:val="000000"/>
           <w:sz w:val="24"/>
           <w:szCs w:val="24"/>
@@ -442,7 +500,7 @@
           <w:szCs w:val="24"/>
           <w:u w:val="single"/>
         </w:rPr>
-        <w:t>{{petitioner_name}}</w:t>
+        <w:t>PETITION FOR REVIEW</w:t>
       </w:r>
     </w:p>
     <w:p>
@@ -461,25 +519,25 @@
           <w:sz w:val="24"/>
           <w:szCs w:val="24"/>
         </w:rPr>
-        <w:t xml:space="preserve">{{petitioner_name}} Petitioner, {{petitioner_name}}, by and though counsel, in accordance with §§ 577.041 and 302.311, RSMo, and states and alleges: </w:t>
-      </w:r>
-      <w:r>
-        <w:rPr>
-          <w:rFonts w:ascii="Times New Roman" w:eastAsia="Times New Roman" w:hAnsi="Times New Roman" w:cs="Times New Roman"/>
-          <w:bCs/>
+        <w:t xml:space="preserve">COMES NOW Petitioner, </w:t>
+      </w:r>
+      <w:r>
+        <w:rPr>
+          <w:rFonts w:ascii="Times New Roman" w:hAnsi="Times New Roman" w:eastAsia="Times New Roman" w:cs="Times New Roman"/>
           <w:color w:val="000000"/>
           <w:spacing w:val="-5"/>
           <w:sz w:val="24"/>
           <w:szCs w:val="24"/>
-          <w:highlight w:val="yellow"/>
-        </w:rPr>
-      </w:r>
-      <w:r>
-        <w:rPr>
-          <w:rFonts w:ascii="Times New Roman" w:hAnsi="Times New Roman" w:cs="Times New Roman"/>
-          <w:sz w:val="24"/>
-          <w:szCs w:val="24"/>
-        </w:rPr>
+        </w:rPr>
+        <w:t>{{petitioner_name}}</w:t>
+      </w:r>
+      <w:r>
+        <w:rPr>
+          <w:rFonts w:ascii="Times New Roman" w:hAnsi="Times New Roman" w:cs="Times New Roman"/>
+          <w:sz w:val="24"/>
+          <w:szCs w:val="24"/>
+        </w:rPr>
+        <w:t xml:space="preserve">, by and though counsel, in accordance with §§ 577.041 and 302.311, RSMo, and states and alleges as follows: </w:t>
       </w:r>
     </w:p>
     <w:p>
@@ -507,9 +565,9 @@
       <w:r>
         <w:rPr>
           <w:rFonts w:ascii="Times New Roman" w:hAnsi="Times New Roman" w:cs="Times New Roman"/>
-          <w:sz w:val="24"/>
-          <w:szCs w:val="24"/>
-          <w:highlight w:val="yellow"/>
+          <w:color w:val="000000"/>
+          <w:sz w:val="24"/>
+          <w:szCs w:val="24"/>
         </w:rPr>
         <w:t>{{arrest_county}}</w:t>
       </w:r>
@@ -526,9 +584,16 @@
           <w:rFonts w:ascii="Times New Roman" w:hAnsi="Times New Roman" w:cs="Times New Roman"/>
           <w:sz w:val="24"/>
           <w:szCs w:val="24"/>
-          <w:highlight w:val="yellow"/>
         </w:rPr>
         <w:t>{{arrest_date}}</w:t>
+      </w:r>
+      <w:r>
+        <w:rPr>
+          <w:rFonts w:ascii="Times New Roman" w:hAnsi="Times New Roman" w:cs="Times New Roman"/>
+          <w:sz w:val="24"/>
+          <w:szCs w:val="24"/>
+        </w:rPr>
+        <w:t>;</w:t>
       </w:r>
     </w:p>
     <w:p>
@@ -566,41 +631,7 @@
           <w:sz w:val="24"/>
           <w:szCs w:val="24"/>
         </w:rPr>
-        <w:t xml:space="preserve">3. That the Respondent notified the Petitioner that his privilege of operating a motor vehicle in the State of Missouri was revoked for one year under § 577.041, RSMo, because of the alleged refusal of the Petitioner to submit to a chemical test arising from the arrest of the Petitioner by the </w:t>
-      </w:r>
-      <w:r>
-        <w:rPr>
-          <w:rFonts w:ascii="Times New Roman" w:hAnsi="Times New Roman" w:cs="Times New Roman"/>
-          <w:sz w:val="24"/>
-          <w:szCs w:val="24"/>
-          <w:highlight w:val="yellow"/>
-        </w:rPr>
-        <w:t>{{police_department}}</w:t>
-      </w:r>
-      <w:r>
-        <w:rPr>
-          <w:rFonts w:ascii="Times New Roman" w:hAnsi="Times New Roman" w:cs="Times New Roman"/>
-          <w:sz w:val="24"/>
-          <w:szCs w:val="24"/>
-        </w:rPr>
-        <w:t xml:space="preserve"> for allegedly operating a motor vehicle while intoxicated within</w:t>
-      </w:r>
-      <w:r>
-        <w:rPr>
-          <w:rFonts w:ascii="Times New Roman" w:hAnsi="Times New Roman" w:cs="Times New Roman"/>
-          <w:sz w:val="24"/>
-          <w:szCs w:val="24"/>
-          <w:highlight w:val="yellow"/>
-        </w:rPr>
-        <w:t>{{arrest_county}}</w:t>
-      </w:r>
-      <w:r>
-        <w:rPr>
-          <w:rFonts w:ascii="Times New Roman" w:hAnsi="Times New Roman" w:cs="Times New Roman"/>
-          <w:sz w:val="24"/>
-          <w:szCs w:val="24"/>
-        </w:rPr>
-        <w:t xml:space="preserve"> County, State of Missouri, and that this proposed action of the Director of Revenue would constitute irreparable harm to the Petitioner;</w:t>
+        <w:t>3. That the Respondent notified the Petitioner that his privilege of operating a motor vehicle in the State of Missouri was revoked for one year under § 577.041, RSMo, because of the alleged refusal of the Petitioner to submit to a chemical test arising from the arrest of the Petitioner by the {{police_department}} for allegedly operating a motor vehicle while intoxicated within {{arrest_county}} County, State of Missouri, and that this proposed action of the Director of Revenue would constitute irreparable harm to the Petitioner;</w:t>
       </w:r>
     </w:p>
     <w:p>
@@ -641,7 +672,6 @@
           <w:sz w:val="24"/>
           <w:szCs w:val="24"/>
         </w:rPr>
-        <w:lastRenderedPageBreak/>
         <w:t>4. This revocation was arbitrary and capricious and not authorized by law under</w:t>
       </w:r>
     </w:p>
@@ -674,32 +704,36 @@
         <w:spacing w:after="0" w:line="480" w:lineRule="auto"/>
         <w:rPr>
           <w:rFonts w:ascii="Times New Roman" w:hAnsi="Times New Roman" w:cs="Times New Roman"/>
-          <w:sz w:val="24"/>
-          <w:szCs w:val="24"/>
-        </w:rPr>
-      </w:pPr>
-      <w:r>
-        <w:rPr>
-          <w:rFonts w:ascii="Times New Roman" w:hAnsi="Times New Roman" w:cs="Times New Roman"/>
-          <w:sz w:val="24"/>
-          <w:szCs w:val="24"/>
-        </w:rPr>
-        <w:t>{{petitioner_name}} Petitioner was not placed under arrest by the {{police_department}};</w:t>
-      </w:r>
-      <w:r>
-        <w:rPr>
-          <w:rFonts w:ascii="Times New Roman" w:hAnsi="Times New Roman" w:cs="Times New Roman"/>
-          <w:sz w:val="24"/>
-          <w:szCs w:val="24"/>
-          <w:highlight w:val="yellow"/>
-        </w:rPr>
-      </w:r>
-      <w:r>
-        <w:rPr>
-          <w:rFonts w:ascii="Times New Roman" w:hAnsi="Times New Roman" w:cs="Times New Roman"/>
-          <w:sz w:val="24"/>
-          <w:szCs w:val="24"/>
-        </w:rPr>
+          <w:color w:val="000000"/>
+          <w:sz w:val="24"/>
+          <w:szCs w:val="24"/>
+        </w:rPr>
+      </w:pPr>
+      <w:r>
+        <w:rPr>
+          <w:rFonts w:ascii="Times New Roman" w:hAnsi="Times New Roman" w:cs="Times New Roman"/>
+          <w:sz w:val="24"/>
+          <w:szCs w:val="24"/>
+        </w:rPr>
+        <w:t xml:space="preserve">The Petitioner was not placed under arrest by the </w:t>
+      </w:r>
+      <w:r>
+        <w:rPr>
+          <w:rFonts w:ascii="Times New Roman" w:hAnsi="Times New Roman" w:cs="Times New Roman"/>
+          <w:color w:val="000000"/>
+          <w:sz w:val="24"/>
+          <w:szCs w:val="24"/>
+        </w:rPr>
+        <w:t>{{police_department}}</w:t>
+      </w:r>
+      <w:r>
+        <w:rPr>
+          <w:rFonts w:ascii="Times New Roman" w:hAnsi="Times New Roman" w:cs="Times New Roman"/>
+          <w:color w:val="auto"/>
+          <w:sz w:val="24"/>
+          <w:szCs w:val="24"/>
+        </w:rPr>
+        <w:t>;</w:t>
       </w:r>
     </w:p>
     <w:p>
@@ -722,22 +756,33 @@
           <w:sz w:val="24"/>
           <w:szCs w:val="24"/>
         </w:rPr>
-        <w:t>{{petitioner_name}} arresting officer had no reasonable grounds to believe that the Petitioner was driving a motor vehicle while in an intoxicated condition in {{arrest_county}}, Missouri; and</w:t>
-      </w:r>
-      <w:r>
-        <w:rPr>
-          <w:rFonts w:ascii="Times New Roman" w:hAnsi="Times New Roman" w:cs="Times New Roman"/>
-          <w:sz w:val="24"/>
-          <w:szCs w:val="24"/>
-          <w:highlight w:val="yellow"/>
-        </w:rPr>
-      </w:r>
-      <w:r>
-        <w:rPr>
-          <w:rFonts w:ascii="Times New Roman" w:hAnsi="Times New Roman" w:cs="Times New Roman"/>
-          <w:sz w:val="24"/>
-          <w:szCs w:val="24"/>
-        </w:rPr>
+        <w:t xml:space="preserve">The arresting officer had no reasonable grounds to believe that the Petitioner was driving a motor vehicle while in an intoxicated condition in </w:t>
+      </w:r>
+      <w:r>
+        <w:rPr>
+          <w:rFonts w:ascii="Times New Roman" w:hAnsi="Times New Roman" w:cs="Times New Roman"/>
+          <w:color w:val="000000"/>
+          <w:sz w:val="24"/>
+          <w:szCs w:val="24"/>
+        </w:rPr>
+        <w:t>{{arrest_county}} County</w:t>
+      </w:r>
+      <w:r>
+        <w:rPr>
+          <w:rFonts w:ascii="Times New Roman" w:hAnsi="Times New Roman" w:cs="Times New Roman"/>
+          <w:color w:val="auto"/>
+          <w:sz w:val="24"/>
+          <w:szCs w:val="24"/>
+        </w:rPr>
+        <w:t>,</w:t>
+      </w:r>
+      <w:r>
+        <w:rPr>
+          <w:rFonts w:ascii="Times New Roman" w:hAnsi="Times New Roman" w:cs="Times New Roman"/>
+          <w:sz w:val="24"/>
+          <w:szCs w:val="24"/>
+        </w:rPr>
+        <w:t xml:space="preserve"> Missouri; and</w:t>
       </w:r>
     </w:p>
     <w:p>
@@ -760,20 +805,8 @@
           <w:sz w:val="24"/>
           <w:szCs w:val="24"/>
         </w:rPr>
-        <w:t>{{petitioner_name}} Petitioner did not refuse to submit to a chemical test.</w:t>
-      </w:r>
-    </w:p>
-    <w:p>
-      <w:pPr>
-        <w:pStyle w:val="ListParagraph"/>
-        <w:spacing w:after="0" w:line="480" w:lineRule="auto"/>
-        <w:ind w:left="1800"/>
-        <w:rPr>
-          <w:rFonts w:ascii="Times New Roman" w:hAnsi="Times New Roman" w:cs="Times New Roman"/>
-          <w:sz w:val="24"/>
-          <w:szCs w:val="24"/>
-        </w:rPr>
-      </w:pPr>
+        <w:t>The Petitioner did not refuse to submit to a chemical test.</w:t>
+      </w:r>
     </w:p>
     <w:p>
       <w:pPr>
@@ -791,13 +824,13 @@
           <w:sz w:val="24"/>
           <w:szCs w:val="24"/>
         </w:rPr>
-        <w:t>Wherefore, the Petitioner prays the court to order the Respondent to rescind and remove the chemical refusal revocation and reinstate the Petitioner’s license to drive. {{petitioner_name}} Petitioner further prays for an Order and Decree of the court that the Respondent stay the enforcement of its Order revoking the Petitioner’s driving privileges pending the final disposition of these proceedings for review</w:t>
+        <w:t>Wherefore, the Petitioner respectfully requests that the Court order Respondent to rescind and remove the chemical refusal revocation and reinstate the Petitioner’s license to drive. The Petitioner further requests the Court issue an Order and Decree that the Respondent stay the enforcement of its Order revoking the Petitioner’s driving privileges pending the final disposition of these proceedings for review.</w:t>
       </w:r>
     </w:p>
     <w:p>
       <w:pPr>
         <w:spacing w:after="0" w:line="360" w:lineRule="auto"/>
-        <w:ind w:left="4320" w:firstLine="720"/>
+        <w:ind w:left="3600" w:firstLine="720"/>
         <w:rPr>
           <w:rFonts w:ascii="Times New Roman" w:hAnsi="Times New Roman" w:cs="Times New Roman"/>
           <w:sz w:val="24"/>
@@ -816,7 +849,7 @@
     <w:p>
       <w:pPr>
         <w:spacing w:after="0" w:line="360" w:lineRule="auto"/>
-        <w:ind w:left="4320" w:firstLine="720"/>
+        <w:ind w:left="3600" w:firstLine="720"/>
         <w:rPr>
           <w:rFonts w:ascii="Times New Roman" w:hAnsi="Times New Roman" w:cs="Times New Roman"/>
           <w:sz w:val="24"/>
@@ -830,6 +863,8 @@
           <w:szCs w:val="26"/>
         </w:rPr>
         <w:t>{{firm_name}}</w:t>
+      </w:r>
+      <w:r>
         <w:tab/>
       </w:r>
     </w:p>
@@ -851,51 +886,18 @@
     </w:p>
     <w:p>
       <w:pPr>
-        <w:tabs>
-          <w:tab w:val="left" w:pos="-1440"/>
-        </w:tabs>
-        <w:spacing w:after="0"/>
-        <w:ind w:left="5040" w:hanging="1440"/>
-        <w:jc w:val="both"/>
-        <w:rPr>
-          <w:rFonts w:ascii="Times New Roman" w:hAnsi="Times New Roman" w:cs="Times New Roman"/>
-          <w:sz w:val="26"/>
-          <w:szCs w:val="26"/>
-        </w:rPr>
-      </w:pPr>
-      <w:r>
-        <w:rPr>
-          <w:rFonts w:ascii="Times New Roman" w:hAnsi="Times New Roman" w:cs="Times New Roman"/>
-          <w:sz w:val="26"/>
-          <w:szCs w:val="26"/>
-        </w:rPr>
-        <w:tab/>
-      </w:r>
-      <w:r>
-        <w:rPr>
-          <w:rFonts w:ascii="Times New Roman" w:hAnsi="Times New Roman" w:cs="Times New Roman"/>
-          <w:i/>
-          <w:iCs/>
-          <w:sz w:val="26"/>
-          <w:szCs w:val="26"/>
+        <w:pStyle w:val="NoSpacing"/>
+        <w:bidi w:val="0"/>
+        <w:rPr>
+          <w:rFonts w:ascii="Times New Roman" w:hAnsi="Times New Roman" w:eastAsia="Times New Roman" w:cs="Times New Roman"/>
+          <w:sz w:val="24"/>
+          <w:szCs w:val="24"/>
           <w:u w:val="single"/>
         </w:rPr>
-        <w:t>/s/{{attorney_name}}</w:t>
-      </w:r>
-      <w:r>
-        <w:rPr>
-          <w:rFonts w:ascii="Times New Roman" w:hAnsi="Times New Roman" w:cs="Times New Roman"/>
-          <w:sz w:val="26"/>
-          <w:szCs w:val="26"/>
-        </w:rPr>
-        <w:t>________________</w:t>
-      </w:r>
-    </w:p>
-    <w:p>
-      <w:pPr>
-        <w:tabs>
-          <w:tab w:val="left" w:pos="-1440"/>
-        </w:tabs>
+      </w:pPr>
+    </w:p>
+    <w:p>
+      <w:pPr>
         <w:spacing w:after="0"/>
         <w:ind w:left="5040" w:hanging="2160"/>
         <w:jc w:val="both"/>
@@ -908,23 +910,26 @@
       <w:r>
         <w:rPr>
           <w:rFonts w:ascii="Times New Roman" w:hAnsi="Times New Roman" w:cs="Times New Roman"/>
-          <w:sz w:val="26"/>
-          <w:szCs w:val="26"/>
+          <w:sz w:val="24"/>
+          <w:szCs w:val="24"/>
         </w:rPr>
         <w:t xml:space="preserve">          </w:t>
-        <w:tab/>
-        <w:t>{{attorney_name}}</w:t>
-        <w:tab/>
-        <w:t xml:space="preserve">       </w:t>
-        <w:tab/>
-        <w:t xml:space="preserve"> {{attorney_bar}}</w:t>
-      </w:r>
-    </w:p>
-    <w:p>
-      <w:pPr>
-        <w:tabs>
-          <w:tab w:val="left" w:pos="-1440"/>
-        </w:tabs>
+      </w:r>
+      <w:r>
+        <w:tab/>
+        <w:tab/>
+      </w:r>
+      <w:r>
+        <w:rPr>
+          <w:rFonts w:ascii="Times New Roman" w:hAnsi="Times New Roman" w:cs="Times New Roman"/>
+          <w:sz w:val="24"/>
+          <w:szCs w:val="24"/>
+        </w:rPr>
+        <w:t>{{attorney_name}}, {{attorney_bar}}</w:t>
+      </w:r>
+    </w:p>
+    <w:p>
+      <w:pPr>
         <w:spacing w:after="0"/>
         <w:ind w:left="5040" w:hanging="2160"/>
         <w:jc w:val="both"/>
@@ -940,6 +945,10 @@
           <w:sz w:val="26"/>
           <w:szCs w:val="26"/>
         </w:rPr>
+        <w:t xml:space="preserve">        </w:t>
+      </w:r>
+      <w:r>
+        <w:tab/>
         <w:tab/>
       </w:r>
       <w:r>
@@ -947,25 +956,32 @@
           <w:rFonts w:ascii="Times New Roman" w:hAnsi="Times New Roman" w:cs="Times New Roman"/>
           <w:sz w:val="26"/>
           <w:szCs w:val="26"/>
-          <w:highlight w:val="yellow"/>
-        </w:rPr>
-        <w:t>D. Christopher LaPee</w:t>
-      </w:r>
-      <w:r>
+        </w:rPr>
+        <w:t>{{firm_address}}</w:t>
+      </w:r>
+    </w:p>
+    <w:p>
+      <w:pPr>
+        <w:spacing w:after="0"/>
+        <w:ind w:left="3600" w:firstLine="720"/>
+        <w:jc w:val="both"/>
         <w:rPr>
           <w:rFonts w:ascii="Times New Roman" w:hAnsi="Times New Roman" w:cs="Times New Roman"/>
           <w:sz w:val="26"/>
           <w:szCs w:val="26"/>
         </w:rPr>
-        <w:tab/>
-        <w:t xml:space="preserve"> {{attorney_bar}}</w:t>
-      </w:r>
-    </w:p>
-    <w:p>
-      <w:pPr>
-        <w:tabs>
-          <w:tab w:val="left" w:pos="-1440"/>
-        </w:tabs>
+      </w:pPr>
+      <w:r>
+        <w:rPr>
+          <w:rFonts w:ascii="Times New Roman" w:hAnsi="Times New Roman" w:cs="Times New Roman"/>
+          <w:sz w:val="26"/>
+          <w:szCs w:val="26"/>
+        </w:rPr>
+        <w:t>{{firm_city_state_zip}}</w:t>
+      </w:r>
+    </w:p>
+    <w:p>
+      <w:pPr>
         <w:spacing w:after="0"/>
         <w:ind w:left="5040" w:hanging="2160"/>
         <w:jc w:val="both"/>
@@ -981,16 +997,23 @@
           <w:sz w:val="26"/>
           <w:szCs w:val="26"/>
         </w:rPr>
-        <w:t xml:space="preserve">        </w:t>
-        <w:tab/>
-        <w:t>75 West Lockwood Avenue, Suite 250</w:t>
-      </w:r>
-    </w:p>
-    <w:p>
-      <w:pPr>
-        <w:tabs>
-          <w:tab w:val="left" w:pos="-1440"/>
-        </w:tabs>
+        <w:t xml:space="preserve">          </w:t>
+      </w:r>
+      <w:r>
+        <w:tab/>
+        <w:tab/>
+      </w:r>
+      <w:r>
+        <w:rPr>
+          <w:rFonts w:ascii="Times New Roman" w:hAnsi="Times New Roman" w:cs="Times New Roman"/>
+          <w:sz w:val="26"/>
+          <w:szCs w:val="26"/>
+        </w:rPr>
+        <w:t>Telephone: {{firm_phone}}</w:t>
+      </w:r>
+    </w:p>
+    <w:p>
+      <w:pPr>
         <w:spacing w:after="0"/>
         <w:ind w:left="5040" w:hanging="2160"/>
         <w:jc w:val="both"/>
@@ -1006,20 +1029,50 @@
           <w:sz w:val="26"/>
           <w:szCs w:val="26"/>
         </w:rPr>
-        <w:tab/>
-        <w:t>{{firm_city_state_zip}}</w:t>
-      </w:r>
-    </w:p>
-    <w:p>
-      <w:pPr>
-        <w:tabs>
-          <w:tab w:val="left" w:pos="-1440"/>
-        </w:tabs>
+        <w:t xml:space="preserve">          </w:t>
+      </w:r>
+      <w:r>
+        <w:tab/>
+        <w:tab/>
+      </w:r>
+      <w:r>
+        <w:rPr>
+          <w:rFonts w:ascii="Times New Roman" w:hAnsi="Times New Roman" w:cs="Times New Roman"/>
+          <w:sz w:val="26"/>
+          <w:szCs w:val="26"/>
+        </w:rPr>
+        <w:t>Facsimile: {{firm_fax}}</w:t>
+      </w:r>
+    </w:p>
+    <w:p>
+      <w:pPr>
+        <w:spacing w:after="0"/>
+        <w:ind w:left="4320" w:firstLine="0"/>
+        <w:jc w:val="both"/>
+        <w:rPr>
+          <w:rFonts w:ascii="Times New Roman" w:hAnsi="Times New Roman" w:cs="Times New Roman"/>
+          <w:sz w:val="26"/>
+          <w:szCs w:val="26"/>
+        </w:rPr>
+      </w:pPr>
+      <w:r>
+        <w:rPr>
+          <w:rFonts w:ascii="Times New Roman" w:hAnsi="Times New Roman" w:cs="Times New Roman"/>
+          <w:sz w:val="26"/>
+          <w:szCs w:val="26"/>
+        </w:rPr>
+        <w:t>Email: {{attorney_email}}</w:t>
+      </w:r>
+    </w:p>
+    <w:p>
+      <w:pPr>
         <w:spacing w:after="0"/>
         <w:ind w:left="5040" w:hanging="2160"/>
         <w:jc w:val="both"/>
         <w:rPr>
           <w:rFonts w:ascii="Times New Roman" w:hAnsi="Times New Roman" w:cs="Times New Roman"/>
+          <w:i w:val="1"/>
+          <w:iCs w:val="1"/>
           <w:sz w:val="26"/>
           <w:szCs w:val="26"/>
         </w:rPr>
@@ -1031,431 +1084,65 @@
           <w:szCs w:val="26"/>
         </w:rPr>
         <w:t xml:space="preserve">          </w:t>
-        <w:tab/>
-        <w:t>Telephone:</w:t>
-        <w:tab/>
-        <w:t>(314) 561-9690</w:t>
-      </w:r>
-    </w:p>
-    <w:p>
-      <w:pPr>
-        <w:spacing w:after="0"/>
-        <w:ind w:left="4320" w:firstLine="720"/>
-        <w:jc w:val="both"/>
-        <w:rPr>
-          <w:rFonts w:ascii="Times New Roman" w:hAnsi="Times New Roman" w:cs="Times New Roman"/>
+      </w:r>
+      <w:r>
+        <w:tab/>
+        <w:tab/>
+      </w:r>
+      <w:r>
+        <w:rPr>
+          <w:rFonts w:ascii="Times New Roman" w:hAnsi="Times New Roman" w:cs="Times New Roman"/>
+          <w:i w:val="1"/>
+          <w:iCs w:val="1"/>
           <w:sz w:val="26"/>
           <w:szCs w:val="26"/>
         </w:rPr>
-      </w:pPr>
-      <w:r>
-        <w:rPr>
-          <w:rFonts w:ascii="Times New Roman" w:hAnsi="Times New Roman" w:cs="Times New Roman"/>
-          <w:sz w:val="26"/>
-          <w:szCs w:val="26"/>
-        </w:rPr>
-        <w:t xml:space="preserve">Email:  </w:t>
-      </w:r>
-      <w:hyperlink r:id="rId5" w:history="1">
-        <w:r>
-          <w:rPr>
-            <w:rStyle w:val="Hyperlink"/>
-            <w:rFonts w:ascii="Times New Roman" w:hAnsi="Times New Roman" w:cs="Times New Roman"/>
-            <w:sz w:val="26"/>
-            <w:szCs w:val="26"/>
-          </w:rPr>
-          <w:t>john@jcsattorney.com</w:t>
-        </w:r>
-      </w:hyperlink>
-    </w:p>
-    <w:p>
-      <w:pPr>
-        <w:spacing w:after="0"/>
-        <w:ind w:left="5040" w:firstLine="720"/>
-        <w:jc w:val="both"/>
-        <w:rPr>
-          <w:rFonts w:ascii="Times New Roman" w:hAnsi="Times New Roman" w:cs="Times New Roman"/>
-          <w:sz w:val="26"/>
-          <w:szCs w:val="26"/>
-        </w:rPr>
-      </w:pPr>
-      <w:r>
-        <w:rPr>
-          <w:rFonts w:ascii="Times New Roman" w:hAnsi="Times New Roman" w:cs="Times New Roman"/>
-          <w:sz w:val="26"/>
-          <w:szCs w:val="26"/>
-        </w:rPr>
-        <w:t xml:space="preserve"> </w:t>
-      </w:r>
-      <w:r>
-        <w:rPr>
-          <w:rFonts w:ascii="Times New Roman" w:hAnsi="Times New Roman" w:cs="Times New Roman"/>
-          <w:sz w:val="26"/>
-          <w:szCs w:val="26"/>
-          <w:highlight w:val="yellow"/>
-        </w:rPr>
-        <w:t>clapee</w:t>
-      </w:r>
-      <w:r>
-        <w:rPr>
-          <w:rFonts w:ascii="Times New Roman" w:hAnsi="Times New Roman" w:cs="Times New Roman"/>
-          <w:sz w:val="26"/>
-          <w:szCs w:val="26"/>
-        </w:rPr>
-        <w:t>@jcsattorney.com</w:t>
-      </w:r>
-    </w:p>
-    <w:p>
-      <w:pPr>
-        <w:tabs>
-          <w:tab w:val="left" w:pos="-1440"/>
-        </w:tabs>
-        <w:spacing w:after="0"/>
-        <w:ind w:left="5040" w:hanging="2160"/>
-        <w:jc w:val="both"/>
-        <w:rPr>
-          <w:rFonts w:ascii="Times New Roman" w:hAnsi="Times New Roman" w:cs="Times New Roman"/>
-          <w:i/>
-          <w:sz w:val="26"/>
-          <w:szCs w:val="26"/>
-        </w:rPr>
-      </w:pPr>
-      <w:r>
-        <w:rPr>
-          <w:rFonts w:ascii="Times New Roman" w:hAnsi="Times New Roman" w:cs="Times New Roman"/>
-          <w:sz w:val="26"/>
-          <w:szCs w:val="26"/>
-        </w:rPr>
-        <w:t xml:space="preserve">          </w:t>
-        <w:tab/>
-      </w:r>
-      <w:r>
-        <w:rPr>
-          <w:rFonts w:ascii="Times New Roman" w:hAnsi="Times New Roman" w:cs="Times New Roman"/>
-          <w:i/>
-          <w:sz w:val="26"/>
-          <w:szCs w:val="26"/>
-        </w:rPr>
         <w:t>Attorney for Petitioner</w:t>
       </w:r>
     </w:p>
     <w:p>
       <w:pPr>
-        <w:tabs>
-          <w:tab w:val="left" w:pos="-1440"/>
-        </w:tabs>
-        <w:spacing w:after="0"/>
-        <w:ind w:left="5040" w:hanging="2160"/>
-        <w:jc w:val="both"/>
-        <w:rPr>
-          <w:rFonts w:ascii="Times New Roman" w:hAnsi="Times New Roman" w:cs="Times New Roman"/>
-          <w:i/>
-          <w:sz w:val="26"/>
-          <w:szCs w:val="26"/>
-        </w:rPr>
-      </w:pPr>
-    </w:p>
-    <w:p>
-      <w:pPr>
         <w:spacing w:after="0" w:line="240" w:lineRule="auto"/>
-        <w:jc w:val="center"/>
-        <w:rPr>
-          <w:rFonts w:ascii="Times New Roman" w:eastAsia="ヒラギノ角ゴ Pro W3" w:hAnsi="Times New Roman" w:cs="Times New Roman"/>
-          <w:b/>
-          <w:color w:val="000000"/>
-          <w:sz w:val="24"/>
-          <w:szCs w:val="24"/>
-          <w:u w:val="single"/>
-        </w:rPr>
-      </w:pPr>
-      <w:bookmarkStart w:id="0" w:name="_Hlk29297529"/>
-      <w:r>
-        <w:rPr>
-          <w:rFonts w:ascii="Times New Roman" w:eastAsia="ヒラギノ角ゴ Pro W3" w:hAnsi="Times New Roman" w:cs="Times New Roman"/>
-          <w:b/>
-          <w:color w:val="000000"/>
-          <w:sz w:val="24"/>
-          <w:szCs w:val="24"/>
-          <w:u w:val="single"/>
-        </w:rPr>
-        <w:t>CERTIFICATE OF SERVICE</w:t>
-      </w:r>
-    </w:p>
-    <w:p>
-      <w:pPr>
-        <w:spacing w:after="0" w:line="240" w:lineRule="auto"/>
-        <w:jc w:val="center"/>
-        <w:rPr>
-          <w:rFonts w:ascii="Times New Roman" w:eastAsia="ヒラギノ角ゴ Pro W3" w:hAnsi="Times New Roman" w:cs="Times New Roman"/>
-          <w:b/>
-          <w:color w:val="000000"/>
-          <w:sz w:val="24"/>
-          <w:szCs w:val="24"/>
-          <w:u w:val="single"/>
-        </w:rPr>
-      </w:pPr>
-    </w:p>
-    <w:p>
-      <w:pPr>
-        <w:spacing w:after="0" w:line="240" w:lineRule="auto"/>
-        <w:rPr>
-          <w:rFonts w:ascii="Times New Roman" w:eastAsia="ヒラギノ角ゴ Pro W3" w:hAnsi="Times New Roman" w:cs="Times New Roman"/>
-          <w:color w:val="000000"/>
-          <w:sz w:val="24"/>
-          <w:szCs w:val="24"/>
-          <w:vertAlign w:val="superscript"/>
-        </w:rPr>
-      </w:pPr>
-      <w:r>
-        <w:rPr>
-          <w:rFonts w:ascii="Times New Roman" w:eastAsia="ヒラギノ角ゴ Pro W3" w:hAnsi="Times New Roman" w:cs="Times New Roman"/>
-          <w:color w:val="000000"/>
-          <w:sz w:val="24"/>
-          <w:szCs w:val="24"/>
-        </w:rPr>
-        <w:t>{{petitioner_name}} above signature certifies that a copy of the forgoing was sent Certified via U.S. Mail, on this 16th day of January, 2020 to:</w:t>
-      </w:r>
-      <w:bookmarkStart w:id="1" w:name="_GoBack"/>
-      <w:bookmarkEnd w:id="1"/>
-      <w:r>
-        <w:rPr>
-          <w:rFonts w:ascii="Times New Roman" w:eastAsia="ヒラギノ角ゴ Pro W3" w:hAnsi="Times New Roman" w:cs="Times New Roman"/>
-          <w:color w:val="000000"/>
-          <w:sz w:val="24"/>
-          <w:szCs w:val="24"/>
-          <w:highlight w:val="yellow"/>
-        </w:rPr>
-      </w:r>
-      <w:r>
-        <w:rPr>
-          <w:rFonts w:ascii="Times New Roman" w:eastAsia="ヒラギノ角ゴ Pro W3" w:hAnsi="Times New Roman" w:cs="Times New Roman"/>
-          <w:color w:val="000000"/>
-          <w:sz w:val="24"/>
-          <w:szCs w:val="24"/>
-          <w:highlight w:val="yellow"/>
-          <w:vertAlign w:val="superscript"/>
-        </w:rPr>
-      </w:r>
-      <w:r>
-        <w:rPr>
-          <w:rFonts w:ascii="Times New Roman" w:eastAsia="ヒラギノ角ゴ Pro W3" w:hAnsi="Times New Roman" w:cs="Times New Roman"/>
-          <w:color w:val="000000"/>
-          <w:sz w:val="24"/>
-          <w:szCs w:val="24"/>
-          <w:highlight w:val="yellow"/>
-        </w:rPr>
-      </w:r>
-      <w:r>
-        <w:rPr>
-          <w:rFonts w:ascii="Times New Roman" w:eastAsia="ヒラギノ角ゴ Pro W3" w:hAnsi="Times New Roman" w:cs="Times New Roman"/>
-          <w:color w:val="000000"/>
-          <w:sz w:val="24"/>
-          <w:szCs w:val="24"/>
-        </w:rPr>
-      </w:r>
-    </w:p>
-    <w:bookmarkEnd w:id="0"/>
-    <w:p>
-      <w:pPr>
-        <w:spacing w:after="0" w:line="240" w:lineRule="auto"/>
-        <w:rPr>
-          <w:rFonts w:ascii="Times New Roman" w:eastAsia="ヒラギノ角ゴ Pro W3" w:hAnsi="Times New Roman" w:cs="Times New Roman"/>
-          <w:color w:val="000000"/>
-          <w:sz w:val="24"/>
-          <w:szCs w:val="24"/>
-        </w:rPr>
-      </w:pPr>
-    </w:p>
-    <w:p>
-      <w:pPr>
-        <w:spacing w:after="0" w:line="240" w:lineRule="auto"/>
-        <w:rPr>
-          <w:rFonts w:ascii="Times New Roman" w:eastAsia="ヒラギノ角ゴ Pro W3" w:hAnsi="Times New Roman" w:cs="Times New Roman"/>
-          <w:color w:val="000000"/>
-          <w:sz w:val="24"/>
-          <w:szCs w:val="24"/>
-        </w:rPr>
-      </w:pPr>
-      <w:r>
-        <w:rPr>
-          <w:rFonts w:ascii="Times New Roman" w:eastAsia="ヒラギノ角ゴ Pro W3" w:hAnsi="Times New Roman" w:cs="Times New Roman"/>
-          <w:color w:val="000000"/>
-          <w:sz w:val="24"/>
-          <w:szCs w:val="24"/>
-        </w:rPr>
-        <w:t>Director of Revenue</w:t>
-      </w:r>
-    </w:p>
-    <w:p>
-      <w:pPr>
-        <w:spacing w:after="0" w:line="240" w:lineRule="auto"/>
-        <w:rPr>
-          <w:rFonts w:ascii="Times New Roman" w:eastAsia="ヒラギノ角ゴ Pro W3" w:hAnsi="Times New Roman" w:cs="Times New Roman"/>
-          <w:color w:val="000000"/>
-          <w:sz w:val="24"/>
-          <w:szCs w:val="24"/>
-        </w:rPr>
-      </w:pPr>
-      <w:r>
-        <w:rPr>
-          <w:rFonts w:ascii="Times New Roman" w:eastAsia="ヒラギノ角ゴ Pro W3" w:hAnsi="Times New Roman" w:cs="Times New Roman"/>
-          <w:color w:val="000000"/>
-          <w:sz w:val="24"/>
-          <w:szCs w:val="24"/>
-        </w:rPr>
-        <w:t>Missouri Department of Revenue</w:t>
-      </w:r>
-    </w:p>
-    <w:p>
-      <w:pPr>
-        <w:spacing w:after="0" w:line="240" w:lineRule="auto"/>
-        <w:rPr>
-          <w:rFonts w:ascii="Times New Roman" w:eastAsia="ヒラギノ角ゴ Pro W3" w:hAnsi="Times New Roman" w:cs="Times New Roman"/>
-          <w:color w:val="000000"/>
-          <w:sz w:val="24"/>
-          <w:szCs w:val="24"/>
-        </w:rPr>
-      </w:pPr>
-      <w:r>
-        <w:rPr>
-          <w:rFonts w:ascii="Times New Roman" w:eastAsia="ヒラギノ角ゴ Pro W3" w:hAnsi="Times New Roman" w:cs="Times New Roman"/>
-          <w:color w:val="000000"/>
-          <w:sz w:val="24"/>
-          <w:szCs w:val="24"/>
-        </w:rPr>
-        <w:t>Harry S. Truman State Office Building</w:t>
-      </w:r>
-    </w:p>
-    <w:p>
-      <w:pPr>
-        <w:spacing w:after="0" w:line="240" w:lineRule="auto"/>
-        <w:rPr>
-          <w:rFonts w:ascii="Times New Roman" w:eastAsia="ヒラギノ角ゴ Pro W3" w:hAnsi="Times New Roman" w:cs="Times New Roman"/>
-          <w:color w:val="000000"/>
-          <w:sz w:val="24"/>
-          <w:szCs w:val="24"/>
-        </w:rPr>
-      </w:pPr>
-      <w:r>
-        <w:rPr>
-          <w:rFonts w:ascii="Times New Roman" w:eastAsia="ヒラギノ角ゴ Pro W3" w:hAnsi="Times New Roman" w:cs="Times New Roman"/>
-          <w:color w:val="000000"/>
-          <w:sz w:val="24"/>
-          <w:szCs w:val="24"/>
-        </w:rPr>
-        <w:t>301 West High Street, Room 670</w:t>
-      </w:r>
-    </w:p>
-    <w:p>
-      <w:pPr>
-        <w:spacing w:after="0" w:line="240" w:lineRule="auto"/>
-        <w:rPr>
-          <w:rFonts w:ascii="Times New Roman" w:eastAsia="ヒラギノ角ゴ Pro W3" w:hAnsi="Times New Roman" w:cs="Times New Roman"/>
-          <w:color w:val="000000"/>
-          <w:sz w:val="24"/>
-          <w:szCs w:val="24"/>
-        </w:rPr>
-      </w:pPr>
-      <w:r>
-        <w:rPr>
-          <w:rFonts w:ascii="Times New Roman" w:eastAsia="ヒラギノ角ゴ Pro W3" w:hAnsi="Times New Roman" w:cs="Times New Roman"/>
-          <w:color w:val="000000"/>
-          <w:sz w:val="24"/>
-          <w:szCs w:val="24"/>
-        </w:rPr>
-        <w:t>Jefferson City, MO 65101</w:t>
-      </w:r>
-    </w:p>
-    <w:p>
-      <w:pPr>
-        <w:spacing w:after="0" w:line="240" w:lineRule="auto"/>
-        <w:rPr>
-          <w:rFonts w:ascii="Times New Roman" w:eastAsia="ヒラギノ角ゴ Pro W3" w:hAnsi="Times New Roman" w:cs="Times New Roman"/>
-          <w:color w:val="000000"/>
-          <w:sz w:val="24"/>
-          <w:szCs w:val="24"/>
-        </w:rPr>
-      </w:pPr>
-    </w:p>
-    <w:p>
-      <w:pPr>
-        <w:spacing w:after="0" w:line="240" w:lineRule="auto"/>
-        <w:rPr>
-          <w:rFonts w:ascii="Times New Roman" w:eastAsia="ヒラギノ角ゴ Pro W3" w:hAnsi="Times New Roman" w:cs="Times New Roman"/>
-          <w:color w:val="000000"/>
-          <w:sz w:val="24"/>
-          <w:szCs w:val="24"/>
-        </w:rPr>
-      </w:pPr>
-      <w:r>
-        <w:rPr>
-          <w:rFonts w:ascii="Times New Roman" w:eastAsia="ヒラギノ角ゴ Pro W3" w:hAnsi="Times New Roman" w:cs="Times New Roman"/>
-          <w:color w:val="000000"/>
-          <w:sz w:val="24"/>
-          <w:szCs w:val="24"/>
-        </w:rPr>
-        <w:tab/>
-        <w:tab/>
-        <w:tab/>
-        <w:tab/>
-        <w:tab/>
-        <w:tab/>
-        <w:tab/>
-        <w:tab/>
-        <w:tab/>
-        <w:tab/>
-        <w:tab/>
-        <w:tab/>
-        <w:tab/>
-        <w:tab/>
-        <w:tab/>
-        <w:tab/>
-        <w:tab/>
-        <w:tab/>
-        <w:t xml:space="preserve">                   </w:t>
-        <w:tab/>
-        <w:tab/>
-      </w:r>
-    </w:p>
-    <w:p>
-      <w:pPr>
-        <w:spacing w:after="0" w:line="480" w:lineRule="auto"/>
-        <w:ind w:firstLine="720"/>
-        <w:rPr>
-          <w:rFonts w:ascii="Times New Roman" w:hAnsi="Times New Roman" w:cs="Times New Roman"/>
-          <w:sz w:val="24"/>
-          <w:szCs w:val="24"/>
-        </w:rPr>
-      </w:pPr>
-    </w:p>
-    <w:p>
-      <w:pPr>
-        <w:rPr>
-          <w:rFonts w:ascii="Times New Roman" w:hAnsi="Times New Roman" w:cs="Times New Roman"/>
-          <w:sz w:val="24"/>
-          <w:szCs w:val="24"/>
-        </w:rPr>
-      </w:pPr>
-      <w:r>
-        <w:rPr>
-          <w:rFonts w:ascii="Times New Roman" w:hAnsi="Times New Roman" w:cs="Times New Roman"/>
-          <w:sz w:val="24"/>
-          <w:szCs w:val="24"/>
-        </w:rPr>
-        <w:t xml:space="preserve">                                 </w:t>
-      </w:r>
-    </w:p>
-    <w:p>
-      <w:pPr>
-        <w:rPr>
-          <w:rFonts w:ascii="Times New Roman" w:hAnsi="Times New Roman" w:cs="Times New Roman"/>
-          <w:sz w:val="24"/>
-          <w:szCs w:val="24"/>
-        </w:rPr>
-      </w:pPr>
+        <w:rPr>
+          <w:rFonts w:ascii="Times New Roman" w:hAnsi="Times New Roman" w:eastAsia="ヒラギノ角ゴ Pro W3" w:cs="Times New Roman"/>
+          <w:color w:val="000000"/>
+          <w:sz w:val="24"/>
+          <w:szCs w:val="24"/>
+        </w:rPr>
+      </w:pPr>
+      <w:r>
+        <w:rPr>
+          <w:rFonts w:ascii="Times New Roman" w:hAnsi="Times New Roman" w:eastAsia="ヒラギノ角ゴ Pro W3" w:cs="Times New Roman"/>
+          <w:color w:val="000000"/>
+          <w:sz w:val="24"/>
+          <w:szCs w:val="24"/>
+        </w:rPr>
+        <w:tab/>
+        <w:tab/>
+        <w:tab/>
+        <w:tab/>
+        <w:t xml:space="preserve">             </w:t>
+      </w:r>
+    </w:p>
+    <w:p>
+      <w:pPr>
+        <w:rPr>
+          <w:rFonts w:ascii="Times New Roman" w:hAnsi="Times New Roman" w:cs="Times New Roman"/>
+          <w:sz w:val="24"/>
+          <w:szCs w:val="24"/>
+        </w:rPr>
+      </w:pPr>
+      <w:r>
+        <w:rPr>
+          <w:rFonts w:ascii="Times New Roman" w:hAnsi="Times New Roman" w:cs="Times New Roman"/>
+          <w:sz w:val="24"/>
+          <w:szCs w:val="24"/>
+        </w:rPr>
+        <w:t xml:space="preserve">                                </w:t>
+      </w:r>
     </w:p>
     <w:sectPr>
-      <w:pgSz w:w="12240" w:h="15840"/>
+      <w:pgSz w:w="12240" w:h="15840" w:orient="portrait"/>
       <w:pgMar w:top="1440" w:right="1440" w:bottom="1440" w:left="1440" w:header="720" w:footer="720" w:gutter="0"/>
       <w:cols w:space="720"/>
       <w:docGrid w:linePitch="360"/>
@@ -1465,7 +1152,7 @@
 </file>
 
 <file path=word/numbering.xml><?xml version="1.0" encoding="utf-8"?>
-<w:numbering xmlns:wpc="http://schemas.microsoft.com/office/word/2010/wordprocessingCanvas" xmlns:cx="http://schemas.microsoft.com/office/drawing/2014/chartex" xmlns:cx1="http://schemas.microsoft.com/office/drawing/2015/9/8/chartex" xmlns:cx2="http://schemas.microsoft.com/office/drawing/2015/10/21/chartex" xmlns:cx3="http://schemas.microsoft.com/office/drawing/2016/5/9/chartex" xmlns:cx4="http://schemas.microsoft.com/office/drawing/2016/5/10/chartex" xmlns:cx5="http://schemas.microsoft.com/office/drawing/2016/5/11/chartex" xmlns:cx6="http://schemas.microsoft.com/office/drawing/2016/5/12/chartex" xmlns:cx7="http://schemas.microsoft.com/office/drawing/2016/5/13/chartex" xmlns:cx8="http://schemas.microsoft.com/office/drawing/2016/5/14/chartex" xmlns:mc="http://schemas.openxmlformats.org/markup-compatibility/2006" xmlns:aink="http://schemas.microsoft.com/office/drawing/2016/ink" xmlns:am3d="http://schemas.microsoft.com/office/drawing/2017/model3d" xmlns:o="urn:schemas-microsoft-com:office:office" xmlns:r="http://schemas.openxmlformats.org/officeDocument/2006/relationships" xmlns:m="http://schemas.openxmlformats.org/officeDocument/2006/math" xmlns:v="urn:schemas-microsoft-com:vml" xmlns:wp14="http://schemas.microsoft.com/office/word/2010/wordprocessingDrawing" xmlns:wp="http://schemas.openxmlformats.org/drawingml/2006/wordprocessingDrawing" xmlns:w10="urn:schemas-microsoft-com:office:word" xmlns:w="http://schemas.openxmlformats.org/wordprocessingml/2006/main" xmlns:w14="http://schemas.microsoft.com/office/word/2010/wordml" xmlns:w15="http://schemas.microsoft.com/office/word/2012/wordml" xmlns:w16cid="http://schemas.microsoft.com/office/word/2016/wordml/cid" xmlns:w16se="http://schemas.microsoft.com/office/word/2015/wordml/symex" xmlns:wpg="http://schemas.microsoft.com/office/word/2010/wordprocessingGroup" xmlns:wpi="http://schemas.microsoft.com/office/word/2010/wordprocessingInk" xmlns:wne="http://schemas.microsoft.com/office/word/2006/wordml" xmlns:wps="http://schemas.microsoft.com/office/word/2010/wordprocessingShape" mc:Ignorable="w14 w15 w16se w16cid wp14">
+<w:numbering xmlns:wpc="http://schemas.microsoft.com/office/word/2010/wordprocessingCanvas" xmlns:cx="http://schemas.microsoft.com/office/drawing/2014/chartex" xmlns:cx1="http://schemas.microsoft.com/office/drawing/2015/9/8/chartex" xmlns:cx2="http://schemas.microsoft.com/office/drawing/2015/10/21/chartex" xmlns:cx3="http://schemas.microsoft.com/office/drawing/2016/5/9/chartex" xmlns:cx4="http://schemas.microsoft.com/office/drawing/2016/5/10/chartex" xmlns:cx5="http://schemas.microsoft.com/office/drawing/2016/5/11/chartex" xmlns:cx6="http://schemas.microsoft.com/office/drawing/2016/5/12/chartex" xmlns:cx7="http://schemas.microsoft.com/office/drawing/2016/5/13/chartex" xmlns:cx8="http://schemas.microsoft.com/office/drawing/2016/5/14/chartex" xmlns:mc="http://schemas.openxmlformats.org/markup-compatibility/2006" xmlns:aink="http://schemas.microsoft.com/office/drawing/2016/ink" xmlns:am3d="http://schemas.microsoft.com/office/drawing/2017/model3d" xmlns:o="urn:schemas-microsoft-com:office:office" xmlns:oel="http://schemas.microsoft.com/office/2019/extlst" xmlns:r="http://schemas.openxmlformats.org/officeDocument/2006/relationships" xmlns:m="http://schemas.openxmlformats.org/officeDocument/2006/math" xmlns:v="urn:schemas-microsoft-com:vml" xmlns:wp14="http://schemas.microsoft.com/office/word/2010/wordprocessingDrawing" xmlns:wp="http://schemas.openxmlformats.org/drawingml/2006/wordprocessingDrawing" xmlns:w10="urn:schemas-microsoft-com:office:word" xmlns:w="http://schemas.openxmlformats.org/wordprocessingml/2006/main" xmlns:w14="http://schemas.microsoft.com/office/word/2010/wordml" xmlns:w15="http://schemas.microsoft.com/office/word/2012/wordml" xmlns:w16cex="http://schemas.microsoft.com/office/word/2018/wordml/cex" xmlns:w16cid="http://schemas.microsoft.com/office/word/2016/wordml/cid" xmlns:w16="http://schemas.microsoft.com/office/word/2018/wordml" xmlns:w16du="http://schemas.microsoft.com/office/word/2023/wordml/word16du" xmlns:w16sdtdh="http://schemas.microsoft.com/office/word/2020/wordml/sdtdatahash" xmlns:w16se="http://schemas.microsoft.com/office/word/2015/wordml/symex" xmlns:wpg="http://schemas.microsoft.com/office/word/2010/wordprocessingGroup" xmlns:wpi="http://schemas.microsoft.com/office/word/2010/wordprocessingInk" xmlns:wne="http://schemas.microsoft.com/office/word/2006/wordml" xmlns:wps="http://schemas.microsoft.com/office/word/2010/wordprocessingShape" mc:Ignorable="w14 w15 w16se w16cid w16 w16cex w16sdtdh w16du wp14">
   <w:abstractNum w:abstractNumId="0" w15:restartNumberingAfterBreak="0">
     <w:nsid w:val="453A7D20"/>
     <w:multiLevelType w:val="hybridMultilevel"/>
@@ -1644,21 +1331,21 @@
       </w:pPr>
     </w:lvl>
   </w:abstractNum>
-  <w:num w:numId="1">
+  <w:num w:numId="1" w16cid:durableId="1543517457">
     <w:abstractNumId w:val="1"/>
   </w:num>
-  <w:num w:numId="2">
+  <w:num w:numId="2" w16cid:durableId="1976332155">
     <w:abstractNumId w:val="0"/>
   </w:num>
 </w:numbering>
 </file>
 
 <file path=word/styles.xml><?xml version="1.0" encoding="utf-8"?>
-<w:styles xmlns:mc="http://schemas.openxmlformats.org/markup-compatibility/2006" xmlns:r="http://schemas.openxmlformats.org/officeDocument/2006/relationships" xmlns:w="http://schemas.openxmlformats.org/wordprocessingml/2006/main" xmlns:w14="http://schemas.microsoft.com/office/word/2010/wordml" xmlns:w15="http://schemas.microsoft.com/office/word/2012/wordml" xmlns:w16cid="http://schemas.microsoft.com/office/word/2016/wordml/cid" xmlns:w16se="http://schemas.microsoft.com/office/word/2015/wordml/symex" mc:Ignorable="w14 w15 w16se w16cid">
+<w:styles xmlns:wp14="http://schemas.microsoft.com/office/word/2010/wordprocessingDrawing" xmlns:mc="http://schemas.openxmlformats.org/markup-compatibility/2006" xmlns:r="http://schemas.openxmlformats.org/officeDocument/2006/relationships" xmlns:w="http://schemas.openxmlformats.org/wordprocessingml/2006/main" xmlns:w14="http://schemas.microsoft.com/office/word/2010/wordml" xmlns:w15="http://schemas.microsoft.com/office/word/2012/wordml" xmlns:w16cex="http://schemas.microsoft.com/office/word/2018/wordml/cex" xmlns:w16cid="http://schemas.microsoft.com/office/word/2016/wordml/cid" xmlns:w16="http://schemas.microsoft.com/office/word/2018/wordml" xmlns:w16du="http://schemas.microsoft.com/office/word/2023/wordml/word16du" xmlns:w16sdtdh="http://schemas.microsoft.com/office/word/2020/wordml/sdtdatahash" xmlns:w16se="http://schemas.microsoft.com/office/word/2015/wordml/symex" mc:Ignorable="w14 w15 w16se w16cid w16 w16cex w16sdtdh w16du wp14">
   <w:docDefaults>
     <w:rPrDefault>
       <w:rPr>
-        <w:rFonts w:asciiTheme="minorHAnsi" w:eastAsiaTheme="minorHAnsi" w:hAnsiTheme="minorHAnsi" w:cstheme="minorBidi"/>
+        <w:rFonts w:asciiTheme="minorHAnsi" w:hAnsiTheme="minorHAnsi" w:eastAsiaTheme="minorHAnsi" w:cstheme="minorBidi"/>
         <w:sz w:val="22"/>
         <w:szCs w:val="22"/>
         <w:lang w:val="en-US" w:eastAsia="en-US" w:bidi="ar-SA"/>
@@ -1673,14 +1360,14 @@
   <w:latentStyles w:defLockedState="0" w:defUIPriority="99" w:defSemiHidden="0" w:defUnhideWhenUsed="0" w:defQFormat="0" w:count="376">
     <w:lsdException w:name="Normal" w:uiPriority="0" w:qFormat="1"/>
     <w:lsdException w:name="heading 1" w:uiPriority="9" w:qFormat="1"/>
-    <w:lsdException w:name="heading 2" w:semiHidden="1" w:uiPriority="9" w:unhideWhenUsed="1" w:qFormat="1"/>
-    <w:lsdException w:name="heading 3" w:semiHidden="1" w:uiPriority="9" w:unhideWhenUsed="1" w:qFormat="1"/>
-    <w:lsdException w:name="heading 4" w:semiHidden="1" w:uiPriority="9" w:unhideWhenUsed="1" w:qFormat="1"/>
-    <w:lsdException w:name="heading 5" w:semiHidden="1" w:uiPriority="9" w:unhideWhenUsed="1" w:qFormat="1"/>
-    <w:lsdException w:name="heading 6" w:semiHidden="1" w:uiPriority="9" w:unhideWhenUsed="1" w:qFormat="1"/>
-    <w:lsdException w:name="heading 7" w:semiHidden="1" w:uiPriority="9" w:unhideWhenUsed="1" w:qFormat="1"/>
-    <w:lsdException w:name="heading 8" w:semiHidden="1" w:uiPriority="9" w:unhideWhenUsed="1" w:qFormat="1"/>
-    <w:lsdException w:name="heading 9" w:semiHidden="1" w:uiPriority="9" w:unhideWhenUsed="1" w:qFormat="1"/>
+    <w:lsdException w:name="heading 2" w:uiPriority="9" w:semiHidden="1" w:unhideWhenUsed="1" w:qFormat="1"/>
+    <w:lsdException w:name="heading 3" w:uiPriority="9" w:semiHidden="1" w:unhideWhenUsed="1" w:qFormat="1"/>
+    <w:lsdException w:name="heading 4" w:uiPriority="9" w:semiHidden="1" w:unhideWhenUsed="1" w:qFormat="1"/>
+    <w:lsdException w:name="heading 5" w:uiPriority="9" w:semiHidden="1" w:unhideWhenUsed="1" w:qFormat="1"/>
+    <w:lsdException w:name="heading 6" w:uiPriority="9" w:semiHidden="1" w:unhideWhenUsed="1" w:qFormat="1"/>
+    <w:lsdException w:name="heading 7" w:uiPriority="9" w:semiHidden="1" w:unhideWhenUsed="1" w:qFormat="1"/>
+    <w:lsdException w:name="heading 8" w:uiPriority="9" w:semiHidden="1" w:unhideWhenUsed="1" w:qFormat="1"/>
+    <w:lsdException w:name="heading 9" w:uiPriority="9" w:semiHidden="1" w:unhideWhenUsed="1" w:qFormat="1"/>
     <w:lsdException w:name="index 1" w:semiHidden="1" w:unhideWhenUsed="1"/>
     <w:lsdException w:name="index 2" w:semiHidden="1" w:unhideWhenUsed="1"/>
     <w:lsdException w:name="index 3" w:semiHidden="1" w:unhideWhenUsed="1"/>
@@ -1690,22 +1377,22 @@
     <w:lsdException w:name="index 7" w:semiHidden="1" w:unhideWhenUsed="1"/>
     <w:lsdException w:name="index 8" w:semiHidden="1" w:unhideWhenUsed="1"/>
     <w:lsdException w:name="index 9" w:semiHidden="1" w:unhideWhenUsed="1"/>
-    <w:lsdException w:name="toc 1" w:semiHidden="1" w:uiPriority="39" w:unhideWhenUsed="1"/>
-    <w:lsdException w:name="toc 2" w:semiHidden="1" w:uiPriority="39" w:unhideWhenUsed="1"/>
-    <w:lsdException w:name="toc 3" w:semiHidden="1" w:uiPriority="39" w:unhideWhenUsed="1"/>
-    <w:lsdException w:name="toc 4" w:semiHidden="1" w:uiPriority="39" w:unhideWhenUsed="1"/>
-    <w:lsdException w:name="toc 5" w:semiHidden="1" w:uiPriority="39" w:unhideWhenUsed="1"/>
-    <w:lsdException w:name="toc 6" w:semiHidden="1" w:uiPriority="39" w:unhideWhenUsed="1"/>
-    <w:lsdException w:name="toc 7" w:semiHidden="1" w:uiPriority="39" w:unhideWhenUsed="1"/>
-    <w:lsdException w:name="toc 8" w:semiHidden="1" w:uiPriority="39" w:unhideWhenUsed="1"/>
-    <w:lsdException w:name="toc 9" w:semiHidden="1" w:uiPriority="39" w:unhideWhenUsed="1"/>
+    <w:lsdException w:name="toc 1" w:uiPriority="39" w:semiHidden="1" w:unhideWhenUsed="1"/>
+    <w:lsdException w:name="toc 2" w:uiPriority="39" w:semiHidden="1" w:unhideWhenUsed="1"/>
+    <w:lsdException w:name="toc 3" w:uiPriority="39" w:semiHidden="1" w:unhideWhenUsed="1"/>
+    <w:lsdException w:name="toc 4" w:uiPriority="39" w:semiHidden="1" w:unhideWhenUsed="1"/>
+    <w:lsdException w:name="toc 5" w:uiPriority="39" w:semiHidden="1" w:unhideWhenUsed="1"/>
+    <w:lsdException w:name="toc 6" w:uiPriority="39" w:semiHidden="1" w:unhideWhenUsed="1"/>
+    <w:lsdException w:name="toc 7" w:uiPriority="39" w:semiHidden="1" w:unhideWhenUsed="1"/>
+    <w:lsdException w:name="toc 8" w:uiPriority="39" w:semiHidden="1" w:unhideWhenUsed="1"/>
+    <w:lsdException w:name="toc 9" w:uiPriority="39" w:semiHidden="1" w:unhideWhenUsed="1"/>
     <w:lsdException w:name="Normal Indent" w:semiHidden="1" w:unhideWhenUsed="1"/>
     <w:lsdException w:name="footnote text" w:semiHidden="1" w:unhideWhenUsed="1"/>
     <w:lsdException w:name="annotation text" w:semiHidden="1" w:unhideWhenUsed="1"/>
     <w:lsdException w:name="header" w:semiHidden="1" w:unhideWhenUsed="1"/>
     <w:lsdException w:name="footer" w:semiHidden="1" w:unhideWhenUsed="1"/>
     <w:lsdException w:name="index heading" w:semiHidden="1" w:unhideWhenUsed="1"/>
-    <w:lsdException w:name="caption" w:semiHidden="1" w:uiPriority="35" w:unhideWhenUsed="1" w:qFormat="1"/>
+    <w:lsdException w:name="caption" w:uiPriority="35" w:semiHidden="1" w:unhideWhenUsed="1" w:qFormat="1"/>
     <w:lsdException w:name="table of figures" w:semiHidden="1" w:unhideWhenUsed="1"/>
     <w:lsdException w:name="envelope address" w:semiHidden="1" w:unhideWhenUsed="1"/>
     <w:lsdException w:name="envelope return" w:semiHidden="1" w:unhideWhenUsed="1"/>
@@ -1736,7 +1423,7 @@
     <w:lsdException w:name="Title" w:uiPriority="10" w:qFormat="1"/>
     <w:lsdException w:name="Closing" w:semiHidden="1" w:unhideWhenUsed="1"/>
     <w:lsdException w:name="Signature" w:semiHidden="1" w:unhideWhenUsed="1"/>
-    <w:lsdException w:name="Default Paragraph Font" w:semiHidden="1" w:uiPriority="1" w:unhideWhenUsed="1"/>
+    <w:lsdException w:name="Default Paragraph Font" w:uiPriority="1" w:semiHidden="1" w:unhideWhenUsed="1"/>
     <w:lsdException w:name="Body Text" w:semiHidden="1" w:unhideWhenUsed="1"/>
     <w:lsdException w:name="Body Text Indent" w:semiHidden="1" w:unhideWhenUsed="1"/>
     <w:lsdException w:name="List Continue" w:semiHidden="1" w:unhideWhenUsed="1"/>
@@ -1936,8 +1623,8 @@
     <w:lsdException w:name="Subtle Reference" w:uiPriority="31" w:qFormat="1"/>
     <w:lsdException w:name="Intense Reference" w:uiPriority="32" w:qFormat="1"/>
     <w:lsdException w:name="Book Title" w:uiPriority="33" w:qFormat="1"/>
-    <w:lsdException w:name="Bibliography" w:semiHidden="1" w:uiPriority="37" w:unhideWhenUsed="1"/>
-    <w:lsdException w:name="TOC Heading" w:semiHidden="1" w:uiPriority="39" w:unhideWhenUsed="1" w:qFormat="1"/>
+    <w:lsdException w:name="Bibliography" w:uiPriority="37" w:semiHidden="1" w:unhideWhenUsed="1"/>
+    <w:lsdException w:name="TOC Heading" w:uiPriority="39" w:semiHidden="1" w:unhideWhenUsed="1" w:qFormat="1"/>
     <w:lsdException w:name="Plain Table 1" w:uiPriority="41"/>
     <w:lsdException w:name="Plain Table 2" w:uiPriority="42"/>
     <w:lsdException w:name="Plain Table 3" w:uiPriority="43"/>
@@ -2048,17 +1735,16 @@
     <w:lsdException w:name="Unresolved Mention" w:semiHidden="1" w:unhideWhenUsed="1"/>
     <w:lsdException w:name="Smart Link" w:semiHidden="1" w:unhideWhenUsed="1"/>
   </w:latentStyles>
-  <w:style w:type="paragraph" w:default="1" w:styleId="Normal">
+  <w:style w:type="paragraph" w:styleId="Normal" w:default="1">
     <w:name w:val="Normal"/>
     <w:qFormat/>
   </w:style>
-  <w:style w:type="character" w:default="1" w:styleId="DefaultParagraphFont">
+  <w:style w:type="character" w:styleId="DefaultParagraphFont" w:default="1">
     <w:name w:val="Default Paragraph Font"/>
     <w:uiPriority w:val="1"/>
-    <w:semiHidden/>
     <w:unhideWhenUsed/>
   </w:style>
-  <w:style w:type="table" w:default="1" w:styleId="TableNormal">
+  <w:style w:type="table" w:styleId="TableNormal" w:default="1">
     <w:name w:val="Normal Table"/>
     <w:uiPriority w:val="99"/>
     <w:semiHidden/>
@@ -2073,7 +1759,7 @@
       </w:tblCellMar>
     </w:tblPr>
   </w:style>
-  <w:style w:type="numbering" w:default="1" w:styleId="NoList">
+  <w:style w:type="numbering" w:styleId="NoList" w:default="1">
     <w:name w:val="No List"/>
     <w:uiPriority w:val="99"/>
     <w:semiHidden/>
@@ -2118,7 +1804,7 @@
       <w:szCs w:val="18"/>
     </w:rPr>
   </w:style>
-  <w:style w:type="character" w:customStyle="1" w:styleId="BalloonTextChar">
+  <w:style w:type="character" w:styleId="BalloonTextChar" w:customStyle="1">
     <w:name w:val="Balloon Text Char"/>
     <w:basedOn w:val="DefaultParagraphFont"/>
     <w:link w:val="BalloonText"/>
@@ -2130,6 +1816,15 @@
       <w:sz w:val="18"/>
       <w:szCs w:val="18"/>
     </w:rPr>
+  </w:style>
+  <w:style w:type="paragraph" w:styleId="NoSpacing">
+    <w:uiPriority w:val="1"/>
+    <w:name w:val="No Spacing"/>
+    <w:qFormat/>
+    <w:rsid w:val="0C8E8B17"/>
+    <w:pPr>
+      <w:spacing w:after="0"/>
+    </w:pPr>
   </w:style>
 </w:styles>
 </file>

</xml_diff>